<commit_message>
feat(exits): finalise the three exit-letter templates
Rewrite relieving/experience/no-dues bodies to the approved copy with the brief's merge-tag field names (employeeName, dateOfJoining, lastWorkingDay, settlementAmountFigures/Words, legalEntityName, brandName, object/possessivePronoun). Signatory, legal entity and brand come from config/company.json via the registry, never hardcoded. Relieving/experience keep their letterhead (body-only rewrite preserving the sectPr header/footer refs); no-dues is a plain acknowledgement (no letterhead). Verified every letter renders with zero leftover tags. CONFIRM-WITH-RIDDHI points TODO-commented in the build script.

Co-Authored-By: Claude Opus 4.8 (1M context) <noreply@anthropic.com>
</commit_message>
<xml_diff>
--- a/public/hr-templates/EXPERIENCE-v1.docx
+++ b/public/hr-templates/EXPERIENCE-v1.docx
@@ -9,32 +9,10 @@
       <w:r>
         <w:rPr>
           <w:rFonts w:ascii="Calibri" w:hAnsi="Calibri" w:cs="Calibri" w:asciiTheme="minorAscii" w:hAnsiTheme="minorAscii" w:cstheme="minorAscii"/>
-          <w:b w:val="1"/>
-          <w:bCs w:val="1"/>
           <w:sz w:val="24"/>
           <w:szCs w:val="24"/>
         </w:rPr>
-        <w:t xml:space="preserve">{issueDate}</w:t>
-      </w:r>
-    </w:p>
-    <w:p>
-      <w:pPr>
-        <w:jc w:val="both"/>
-      </w:pPr>
-    </w:p>
-    <w:p>
-      <w:pPr>
-        <w:jc w:val="both"/>
-      </w:pPr>
-      <w:r>
-        <w:rPr>
-          <w:rFonts w:ascii="Calibri" w:hAnsi="Calibri" w:cs="Calibri" w:asciiTheme="minorAscii" w:hAnsiTheme="minorAscii" w:cstheme="minorAscii"/>
-          <w:b w:val="1"/>
-          <w:bCs w:val="1"/>
-          <w:sz w:val="24"/>
-          <w:szCs w:val="24"/>
-        </w:rPr>
-        <w:t xml:space="preserve">TO WHOMSOEVER IT MAY CONCERN</w:t>
+        <w:t xml:space="preserve">Date: {issueDate}</w:t>
       </w:r>
     </w:p>
     <w:p>
@@ -70,7 +48,7 @@
           <w:sz w:val="24"/>
           <w:szCs w:val="24"/>
         </w:rPr>
-        <w:t xml:space="preserve">This is to certify that {employeeName} was employed with {employerName} as {designation} from {employmentFrom} to {employmentTo}.</w:t>
+        <w:t xml:space="preserve">This is to certify that {employeeName} was employed with {brandName} as a {designation} from {dateOfJoining} to {lastWorkingDay}.</w:t>
       </w:r>
     </w:p>
     <w:p>
@@ -88,25 +66,7 @@
           <w:sz w:val="24"/>
           <w:szCs w:val="24"/>
         </w:rPr>
-        <w:t xml:space="preserve">During {pronounPossessive} tenure with us, we found {pronounObject} to be sincere, hardworking and professional in {pronounPossessive} conduct. {pronounSubject} discharged {pronounPossessive} responsibilities to our satisfaction.</w:t>
-      </w:r>
-    </w:p>
-    <w:p>
-      <w:pPr>
-        <w:jc w:val="both"/>
-      </w:pPr>
-    </w:p>
-    <w:p>
-      <w:pPr>
-        <w:jc w:val="both"/>
-      </w:pPr>
-      <w:r>
-        <w:rPr>
-          <w:rFonts w:ascii="Calibri" w:hAnsi="Calibri" w:cs="Calibri" w:asciiTheme="minorAscii" w:hAnsiTheme="minorAscii" w:cstheme="minorAscii"/>
-          <w:sz w:val="24"/>
-          <w:szCs w:val="24"/>
-        </w:rPr>
-        <w:t xml:space="preserve">We wish {pronounObject} all the best for {pronounPossessive} future endeavours.</w:t>
+        <w:t xml:space="preserve">{employeeName} demonstrated efficiency at work and was a valuable contributor to the team. We found {objectPronoun} to be sincere, dedicated, and hardworking throughout {possessivePronoun} employment. We wish {objectPronoun} all the best in {possessivePronoun} future endeavors.</w:t>
       </w:r>
     </w:p>
     <w:p>
@@ -131,18 +91,13 @@
       <w:pPr>
         <w:jc w:val="both"/>
       </w:pPr>
-    </w:p>
-    <w:p>
-      <w:pPr>
-        <w:jc w:val="both"/>
-      </w:pPr>
       <w:r>
         <w:rPr>
           <w:rFonts w:ascii="Calibri" w:hAnsi="Calibri" w:cs="Calibri" w:asciiTheme="minorAscii" w:hAnsiTheme="minorAscii" w:cstheme="minorAscii"/>
           <w:sz w:val="24"/>
           <w:szCs w:val="24"/>
         </w:rPr>
-        <w:t xml:space="preserve">Yours faithfully,</w:t>
+        <w:t xml:space="preserve">Yours faithfully</w:t>
       </w:r>
     </w:p>
     <w:p>

</xml_diff>